<commit_message>
Update reviewed portrait export from source v4.2.1
</commit_message>
<xml_diff>
--- a/public/jose-luis-illana-portfolio/assets/jose-luis-illana-cv-en.docx
+++ b/public/jose-luis-illana-portfolio/assets/jose-luis-illana-cv-en.docx
@@ -47,7 +47,7 @@
             <w:r>
               <w:drawing>
                 <wp:inline distT="0" distB="0" distL="0" distR="0">
-                  <wp:extent cx="2066925" cy="2072105"/>
+                  <wp:extent cx="1338804" cy="2066925"/>
                   <wp:effectExtent t="0" r="0" b="0" l="0"/>
                   <wp:docPr id="1" name="Approved portrait" descr="Professional portrait of José Luis Illana Ruiz" title="José Luis Illana Ruiz"/>
                   <wp:cNvGraphicFramePr>
@@ -72,7 +72,7 @@
                         <pic:spPr bwMode="auto">
                           <a:xfrm>
                             <a:off x="0" y="0"/>
-                            <a:ext cx="2066925" cy="2072105"/>
+                            <a:ext cx="1338804" cy="2066925"/>
                           </a:xfrm>
                           <a:prstGeom prst="rect">
                             <a:avLst/>

</xml_diff>